<commit_message>
Submission-quality pass on the Phase 3 document (GPT 5.6 SOL High).
Co-authored-by: Chintan Dedhia <shadybrook@users.noreply.github.com>
</commit_message>
<xml_diff>
--- a/deliverables/phase3-document/CertaRig_Phase3_Document.docx
+++ b/deliverables/phase3-document/CertaRig_Phase3_Document.docx
@@ -144,12 +144,12 @@
     </w:p>
     <w:p>
       <w:r>
-        <w:t>Phase 3 demonstrates implementation readiness. Its purpose is to show that the design choices made in the earlier phases have been validated through a working implementation, and to assess honestly what the system can and cannot do today: its reliability under test, its measured behaviour on real hardware, its known limitations, and its potential as the foundation for the capstone project.</w:t>
+        <w:t>Phase 3 asks whether CertaRig is ready to move from proof of concept to capstone development. This document therefore evaluates four things: what is implemented, how it was tested, what the physical bench evidence proves, and which limitations must be resolved next.</w:t>
       </w:r>
     </w:p>
     <w:p>
       <w:r>
-        <w:t>CertaRig is a test-operations platform for instrumented test benches ("rigs"). For a reader with no prior exposure to the project, the core idea is this: an AI agent interprets what an operator asks for in natural language ("run the 4.2 bar pressure test"), but a small, deterministic software kernel is the only component allowed to measure sensor values, compare them to limits, latch trips, and drive the physical output — on the demonstration bench, a relay commanded through Raspberry Pi general-purpose input/output pin 23 (GPIO23). Every run produces a checksummed evidence bundle as a first-class output. The design question Phase 3 set out to validate is not "can an AI operate a rig?" but "who is allowed to say yes when a physical output may be energized?" — and to prove the answer (the kernel, never the model) with hardware evidence.</w:t>
+        <w:t>CertaRig is a test-operations platform for instrumented test benches ("rigs"). An AI agent translates an operator's natural-language request, such as "run the 4.2 bar pressure test," into an approved procedure. A small deterministic software kernel then reads the sensors, compares values with configured limits, latches trips, and controls the output. On the demonstration bench, that output is a relay commanded through Raspberry Pi general-purpose input/output pin 23 (GPIO23). Every run produces checksummed evidence. The central design question is therefore not "can an AI operate a rig?" but "who is allowed to authorize a physical output?" CertaRig's answer is the kernel, never the language model.</w:t>
       </w:r>
     </w:p>
     <w:p>
@@ -250,7 +250,7 @@
         <w:t>Phase 3 — implementation and validation (this document).</w:t>
       </w:r>
       <w:r>
-        <w:t xml:space="preserve"> The platform was hardened into a user-deployable system (Edge API, Studio operator console, digital twin, provider-neutral agent, evidence pipeline), and on 12 September 2026 it crossed a six-gate commissioning ladder on the physical dry bench, culminating in agent-initiated hardware procedures with the kernel owning every safety decision, followed by clean restoration of the frozen Phase 3 dashboard.</w:t>
+        <w:t xml:space="preserve"> The PoC was developed into a deployable platform: Edge API, Studio operator console, digital twin, provider-neutral agent, and evidence pipeline. On 12 September 2026 it crossed a six-gate commissioning ladder on the dry bench. Agent-initiated procedures ran on hardware while the kernel retained every safety decision, after which the frozen course dashboard was restored and verified.</w:t>
       </w:r>
     </w:p>
     <w:p>
@@ -475,7 +475,7 @@
         <w:pStyle w:val="ListBullet"/>
       </w:pPr>
       <w:r>
-        <w:t xml:space="preserve">Human-approval workflow: </w:t>
+        <w:t xml:space="preserve">Human-approval workflow: an agent cannot invoke </w:t>
       </w:r>
       <w:r>
         <w:rPr>
@@ -485,7 +485,7 @@
         <w:t>reset_trip</w:t>
       </w:r>
       <w:r>
-        <w:t xml:space="preserve"> and </w:t>
+        <w:t xml:space="preserve"> or </w:t>
       </w:r>
       <w:r>
         <w:rPr>
@@ -495,7 +495,7 @@
         <w:t>shutdown</w:t>
       </w:r>
       <w:r>
-        <w:t xml:space="preserve"> always require a human grant; the agent receives an HTTP 428 that deep-links to the Approvals view.</w:t>
+        <w:t xml:space="preserve"> without a human grant; an unapproved attempt receives HTTP 428 and deep-links to the Approvals view.</w:t>
       </w:r>
     </w:p>
     <w:p>
@@ -734,7 +734,7 @@
               <w:rPr>
                 <w:sz w:val="20"/>
               </w:rPr>
-              <w:t>Six approved procedures</w:t>
+              <w:t>Six bench qualification procedures</w:t>
             </w:r>
           </w:p>
         </w:tc>
@@ -752,7 +752,7 @@
               <w:rPr>
                 <w:sz w:val="20"/>
               </w:rPr>
-              <w:t>ADC validation, relay truth table, pressure guardrail (4.2 bar), flow guardrail (15 L/min), dual-input guardrail, E-stop anti-restart</w:t>
+              <w:t>ADC validation, relay truth table, pressure guardrail (4.2 bar), flow guardrail (15 L/min), dual-input guardrail, E-stop anti-restart; a thermal-soak skill is an additional simulator extension</w:t>
             </w:r>
           </w:p>
         </w:tc>
@@ -1004,6 +1004,12 @@
             </w:r>
             <w:r>
               <w:rPr>
+                <w:sz w:val="20"/>
+              </w:rPr>
+              <w:t xml:space="preserve">Agent requests for </w:t>
+            </w:r>
+            <w:r>
+              <w:rPr>
                 <w:rFonts w:ascii="Consolas" w:hAnsi="Consolas"/>
                 <w:sz w:val="20"/>
               </w:rPr>
@@ -1026,7 +1032,7 @@
               <w:rPr>
                 <w:sz w:val="20"/>
               </w:rPr>
-              <w:t xml:space="preserve"> gated on explicit human grants</w:t>
+              <w:t xml:space="preserve"> are gated on explicit human grants</w:t>
             </w:r>
           </w:p>
         </w:tc>
@@ -1129,6 +1135,524 @@
       </w:tr>
     </w:tbl>
     <w:p/>
+    <w:p>
+      <w:pPr>
+        <w:pStyle w:val="Heading3"/>
+      </w:pPr>
+      <w:r>
+        <w:t>2.3 Why This AI, Benchmarking, and Fallbacks</w:t>
+      </w:r>
+    </w:p>
+    <w:p>
+      <w:r>
+        <w:rPr>
+          <w:b/>
+        </w:rPr>
+        <w:t>Why use AI at all?</w:t>
+      </w:r>
+      <w:r>
+        <w:t xml:space="preserve"> Test operators express intent in varied language, while rigs require exact procedure identifiers, units, and ordered steps. A language model is useful at that translation and explanation boundary. It is deliberately not used for arithmetic or safety: deterministic code is easier to test, reproduce, and audit for those tasks.</w:t>
+      </w:r>
+    </w:p>
+    <w:p>
+      <w:r>
+        <w:rPr>
+          <w:b/>
+        </w:rPr>
+        <w:t>Why these specific choices?</w:t>
+      </w:r>
+      <w:r>
+        <w:t xml:space="preserve"> The proven runtime choice is </w:t>
+      </w:r>
+      <w:r>
+        <w:rPr>
+          <w:b/>
+        </w:rPr>
+        <w:t>Fake</w:t>
+      </w:r>
+      <w:r>
+        <w:t xml:space="preserve">, a deterministic rule-based provider. It requires no API key, gives repeatable routing in tests, and was the provider that initiated the 12 September hardware procedures. For a future live interpreter, the first configured choice is </w:t>
+      </w:r>
+      <w:r>
+        <w:rPr>
+          <w:b/>
+        </w:rPr>
+        <w:t>Anthropic `claude-sonnet-4-5`</w:t>
+      </w:r>
+      <w:r>
+        <w:t xml:space="preserve"> because its API exposes tool use directly and the adapter maps CertaRig's provider-neutral tool schema to native tool-use blocks. The second choice is </w:t>
+      </w:r>
+      <w:r>
+        <w:rPr>
+          <w:b/>
+        </w:rPr>
+        <w:t>OpenAI `gpt-4.1-mini`</w:t>
+      </w:r>
+      <w:r>
+        <w:t xml:space="preserve"> through the OpenAI API; the same adapter can target an OpenAI-compatible endpoint through </w:t>
+      </w:r>
+      <w:r>
+        <w:rPr>
+          <w:rFonts w:ascii="Consolas" w:hAnsi="Consolas"/>
+          <w:sz w:val="20"/>
+        </w:rPr>
+        <w:t>OPENAI_BASE_URL</w:t>
+      </w:r>
+      <w:r>
+        <w:t>, including a local service. Transcript replay is a further deterministic regression option. These are configurable alternatives, not automatic failover: no live provider has yet been qualified on the bench.</w:t>
+      </w:r>
+    </w:p>
+    <w:p>
+      <w:r>
+        <w:t>The benchmark is specific to CertaRig, not a general chat or trivia score:</w:t>
+      </w:r>
+    </w:p>
+    <w:tbl>
+      <w:tblPr>
+        <w:tblStyle w:val="LightGrid-Accent1"/>
+        <w:tblW w:type="auto" w:w="0"/>
+        <w:jc w:val="center"/>
+        <w:tblLook w:firstColumn="1" w:firstRow="1" w:lastColumn="0" w:lastRow="0" w:noHBand="0" w:noVBand="1" w:val="04A0"/>
+      </w:tblPr>
+      <w:tblGrid>
+        <w:gridCol w:w="2880"/>
+        <w:gridCol w:w="2880"/>
+        <w:gridCol w:w="2880"/>
+      </w:tblGrid>
+      <w:tr>
+        <w:tc>
+          <w:tcPr>
+            <w:tcW w:type="dxa" w:w="2880"/>
+          </w:tcPr>
+          <w:p>
+            <w:r>
+              <w:rPr>
+                <w:b/>
+                <w:sz w:val="20"/>
+              </w:rPr>
+            </w:r>
+            <w:r>
+              <w:rPr>
+                <w:b/>
+                <w:sz w:val="20"/>
+              </w:rPr>
+              <w:t>Use-case criterion</w:t>
+            </w:r>
+          </w:p>
+        </w:tc>
+        <w:tc>
+          <w:tcPr>
+            <w:tcW w:type="dxa" w:w="2880"/>
+          </w:tcPr>
+          <w:p>
+            <w:r>
+              <w:rPr>
+                <w:b/>
+                <w:sz w:val="20"/>
+              </w:rPr>
+            </w:r>
+            <w:r>
+              <w:rPr>
+                <w:b/>
+                <w:sz w:val="20"/>
+              </w:rPr>
+              <w:t>Required behaviour</w:t>
+            </w:r>
+          </w:p>
+        </w:tc>
+        <w:tc>
+          <w:tcPr>
+            <w:tcW w:type="dxa" w:w="2880"/>
+          </w:tcPr>
+          <w:p>
+            <w:r>
+              <w:rPr>
+                <w:b/>
+                <w:sz w:val="20"/>
+              </w:rPr>
+            </w:r>
+            <w:r>
+              <w:rPr>
+                <w:b/>
+                <w:sz w:val="20"/>
+              </w:rPr>
+              <w:t>Current evidence</w:t>
+            </w:r>
+          </w:p>
+        </w:tc>
+      </w:tr>
+      <w:tr>
+        <w:tc>
+          <w:tcPr>
+            <w:tcW w:type="dxa" w:w="2880"/>
+          </w:tcPr>
+          <w:p>
+            <w:r>
+              <w:rPr>
+                <w:sz w:val="20"/>
+              </w:rPr>
+            </w:r>
+            <w:r>
+              <w:rPr>
+                <w:sz w:val="20"/>
+              </w:rPr>
+              <w:t>Approved-skill routing</w:t>
+            </w:r>
+          </w:p>
+        </w:tc>
+        <w:tc>
+          <w:tcPr>
+            <w:tcW w:type="dxa" w:w="2880"/>
+          </w:tcPr>
+          <w:p>
+            <w:r>
+              <w:rPr>
+                <w:sz w:val="20"/>
+              </w:rPr>
+            </w:r>
+            <w:r>
+              <w:rPr>
+                <w:sz w:val="20"/>
+              </w:rPr>
+              <w:t>Map operator wording to the correct approved procedure</w:t>
+            </w:r>
+          </w:p>
+        </w:tc>
+        <w:tc>
+          <w:tcPr>
+            <w:tcW w:type="dxa" w:w="2880"/>
+          </w:tcPr>
+          <w:p>
+            <w:r>
+              <w:rPr>
+                <w:sz w:val="20"/>
+              </w:rPr>
+            </w:r>
+            <w:r>
+              <w:rPr>
+                <w:sz w:val="20"/>
+              </w:rPr>
+              <w:t>Fake routed the lab procedures; agent policy and orchestrator tests pass</w:t>
+            </w:r>
+          </w:p>
+        </w:tc>
+      </w:tr>
+      <w:tr>
+        <w:tc>
+          <w:tcPr>
+            <w:tcW w:type="dxa" w:w="2880"/>
+          </w:tcPr>
+          <w:p>
+            <w:r>
+              <w:rPr>
+                <w:sz w:val="20"/>
+              </w:rPr>
+            </w:r>
+            <w:r>
+              <w:rPr>
+                <w:sz w:val="20"/>
+              </w:rPr>
+              <w:t>Tool discipline</w:t>
+            </w:r>
+          </w:p>
+        </w:tc>
+        <w:tc>
+          <w:tcPr>
+            <w:tcW w:type="dxa" w:w="2880"/>
+          </w:tcPr>
+          <w:p>
+            <w:r>
+              <w:rPr>
+                <w:sz w:val="20"/>
+              </w:rPr>
+            </w:r>
+            <w:r>
+              <w:rPr>
+                <w:sz w:val="20"/>
+              </w:rPr>
+              <w:t>Call only tools exposed by the capability manifest</w:t>
+            </w:r>
+          </w:p>
+        </w:tc>
+        <w:tc>
+          <w:tcPr>
+            <w:tcW w:type="dxa" w:w="2880"/>
+          </w:tcPr>
+          <w:p>
+            <w:r>
+              <w:rPr>
+                <w:sz w:val="20"/>
+              </w:rPr>
+            </w:r>
+            <w:r>
+              <w:rPr>
+                <w:sz w:val="20"/>
+              </w:rPr>
+              <w:t>Enforced by manifest filtering and contract tests; dangerous tools remain unavailable</w:t>
+            </w:r>
+          </w:p>
+        </w:tc>
+      </w:tr>
+      <w:tr>
+        <w:tc>
+          <w:tcPr>
+            <w:tcW w:type="dxa" w:w="2880"/>
+          </w:tcPr>
+          <w:p>
+            <w:r>
+              <w:rPr>
+                <w:sz w:val="20"/>
+              </w:rPr>
+            </w:r>
+            <w:r>
+              <w:rPr>
+                <w:sz w:val="20"/>
+              </w:rPr>
+              <w:t>Safety-boundary discipline</w:t>
+            </w:r>
+          </w:p>
+        </w:tc>
+        <w:tc>
+          <w:tcPr>
+            <w:tcW w:type="dxa" w:w="2880"/>
+          </w:tcPr>
+          <w:p>
+            <w:r>
+              <w:rPr>
+                <w:sz w:val="20"/>
+              </w:rPr>
+            </w:r>
+            <w:r>
+              <w:rPr>
+                <w:sz w:val="20"/>
+              </w:rPr>
+              <w:t>Never compare live values or claim to make a trip decision</w:t>
+            </w:r>
+          </w:p>
+        </w:tc>
+        <w:tc>
+          <w:tcPr>
+            <w:tcW w:type="dxa" w:w="2880"/>
+          </w:tcPr>
+          <w:p>
+            <w:r>
+              <w:rPr>
+                <w:sz w:val="20"/>
+              </w:rPr>
+            </w:r>
+            <w:r>
+              <w:rPr>
+                <w:sz w:val="20"/>
+              </w:rPr>
+              <w:t>Fake transcripts show read skill → start procedure → wait → report kernel result</w:t>
+            </w:r>
+          </w:p>
+        </w:tc>
+      </w:tr>
+      <w:tr>
+        <w:tc>
+          <w:tcPr>
+            <w:tcW w:type="dxa" w:w="2880"/>
+          </w:tcPr>
+          <w:p>
+            <w:r>
+              <w:rPr>
+                <w:sz w:val="20"/>
+              </w:rPr>
+            </w:r>
+            <w:r>
+              <w:rPr>
+                <w:sz w:val="20"/>
+              </w:rPr>
+              <w:t>Human boundary</w:t>
+            </w:r>
+          </w:p>
+        </w:tc>
+        <w:tc>
+          <w:tcPr>
+            <w:tcW w:type="dxa" w:w="2880"/>
+          </w:tcPr>
+          <w:p>
+            <w:r>
+              <w:rPr>
+                <w:sz w:val="20"/>
+              </w:rPr>
+            </w:r>
+            <w:r>
+              <w:rPr>
+                <w:sz w:val="20"/>
+              </w:rPr>
+              <w:t xml:space="preserve">Stop for approval on </w:t>
+            </w:r>
+            <w:r>
+              <w:rPr>
+                <w:rFonts w:ascii="Consolas" w:hAnsi="Consolas"/>
+                <w:sz w:val="20"/>
+              </w:rPr>
+              <w:t>reset_trip</w:t>
+            </w:r>
+            <w:r>
+              <w:rPr>
+                <w:sz w:val="20"/>
+              </w:rPr>
+              <w:t xml:space="preserve"> and </w:t>
+            </w:r>
+            <w:r>
+              <w:rPr>
+                <w:rFonts w:ascii="Consolas" w:hAnsi="Consolas"/>
+                <w:sz w:val="20"/>
+              </w:rPr>
+              <w:t>shutdown</w:t>
+            </w:r>
+          </w:p>
+        </w:tc>
+        <w:tc>
+          <w:tcPr>
+            <w:tcW w:type="dxa" w:w="2880"/>
+          </w:tcPr>
+          <w:p>
+            <w:r>
+              <w:rPr>
+                <w:sz w:val="20"/>
+              </w:rPr>
+            </w:r>
+            <w:r>
+              <w:rPr>
+                <w:sz w:val="20"/>
+              </w:rPr>
+              <w:t>HTTP 428 approval flow is covered by contract tests</w:t>
+            </w:r>
+          </w:p>
+        </w:tc>
+      </w:tr>
+      <w:tr>
+        <w:tc>
+          <w:tcPr>
+            <w:tcW w:type="dxa" w:w="2880"/>
+          </w:tcPr>
+          <w:p>
+            <w:r>
+              <w:rPr>
+                <w:sz w:val="20"/>
+              </w:rPr>
+            </w:r>
+            <w:r>
+              <w:rPr>
+                <w:sz w:val="20"/>
+              </w:rPr>
+              <w:t>Reproducibility</w:t>
+            </w:r>
+          </w:p>
+        </w:tc>
+        <w:tc>
+          <w:tcPr>
+            <w:tcW w:type="dxa" w:w="2880"/>
+          </w:tcPr>
+          <w:p>
+            <w:r>
+              <w:rPr>
+                <w:sz w:val="20"/>
+              </w:rPr>
+            </w:r>
+            <w:r>
+              <w:rPr>
+                <w:sz w:val="20"/>
+              </w:rPr>
+              <w:t>Preserve and replay the complete interaction</w:t>
+            </w:r>
+          </w:p>
+        </w:tc>
+        <w:tc>
+          <w:tcPr>
+            <w:tcW w:type="dxa" w:w="2880"/>
+          </w:tcPr>
+          <w:p>
+            <w:r>
+              <w:rPr>
+                <w:sz w:val="20"/>
+              </w:rPr>
+            </w:r>
+            <w:r>
+              <w:rPr>
+                <w:sz w:val="20"/>
+              </w:rPr>
+              <w:t>Transcript and strict replay providers are implemented and tested</w:t>
+            </w:r>
+          </w:p>
+        </w:tc>
+      </w:tr>
+      <w:tr>
+        <w:tc>
+          <w:tcPr>
+            <w:tcW w:type="dxa" w:w="2880"/>
+          </w:tcPr>
+          <w:p>
+            <w:r>
+              <w:rPr>
+                <w:sz w:val="20"/>
+              </w:rPr>
+            </w:r>
+            <w:r>
+              <w:rPr>
+                <w:sz w:val="20"/>
+              </w:rPr>
+              <w:t>Provider comparison</w:t>
+            </w:r>
+          </w:p>
+        </w:tc>
+        <w:tc>
+          <w:tcPr>
+            <w:tcW w:type="dxa" w:w="2880"/>
+          </w:tcPr>
+          <w:p>
+            <w:r>
+              <w:rPr>
+                <w:sz w:val="20"/>
+              </w:rPr>
+            </w:r>
+            <w:r>
+              <w:rPr>
+                <w:sz w:val="20"/>
+              </w:rPr>
+              <w:t>Run the same prompt suite unchanged across candidates</w:t>
+            </w:r>
+          </w:p>
+        </w:tc>
+        <w:tc>
+          <w:tcPr>
+            <w:tcW w:type="dxa" w:w="2880"/>
+          </w:tcPr>
+          <w:p>
+            <w:r>
+              <w:rPr>
+                <w:sz w:val="20"/>
+              </w:rPr>
+            </w:r>
+            <w:r>
+              <w:rPr>
+                <w:sz w:val="20"/>
+              </w:rPr>
+              <w:t>Pending for Claude and OpenAI; live adapters are unit-tested only</w:t>
+            </w:r>
+          </w:p>
+        </w:tc>
+      </w:tr>
+    </w:tbl>
+    <w:p/>
+    <w:p>
+      <w:r>
+        <w:t xml:space="preserve">This benchmark establishes a clear admission rule for the capstone: Claude or the OpenAI fallback may assist on a real rig only after passing the same routing, tool, approval, refusal, and replay cases as Fake. Phase 3 validates the deterministic provider and the individual policy, approval, and replay mechanisms; it does </w:t>
+      </w:r>
+      <w:r>
+        <w:rPr>
+          <w:b/>
+        </w:rPr>
+        <w:t>not</w:t>
+      </w:r>
+      <w:r>
+        <w:t xml:space="preserve"> report a live-model comparison that was never run.</w:t>
+      </w:r>
+    </w:p>
     <w:p>
       <w:pPr>
         <w:pStyle w:val="Heading2"/>
@@ -2855,7 +3379,7 @@
         <w:t>Stability.</w:t>
       </w:r>
       <w:r>
-        <w:t xml:space="preserve"> The kernel is exercised by a Hypothesis property-based state machine that attempts arbitrary command orderings and sensor faults; no sequence violating the output invariant or anti-restart property has been found. All 213 software tests pass, </w:t>
+        <w:t xml:space="preserve"> A Hypothesis property-based state machine generates arbitrary command orderings and sensor faults while continuously checking the output invariant and anti-restart rule. All 213 software tests in the stated suites passed in this environment; </w:t>
       </w:r>
       <w:r>
         <w:rPr>
@@ -2865,7 +3389,7 @@
         <w:t>make check</w:t>
       </w:r>
       <w:r>
-        <w:t xml:space="preserve"> enforces 90% coverage, and a </w:t>
+        <w:t xml:space="preserve"> sets a 90% coverage threshold, and </w:t>
       </w:r>
       <w:r>
         <w:rPr>
@@ -2875,7 +3399,7 @@
         <w:t>make soak</w:t>
       </w:r>
       <w:r>
-        <w:t xml:space="preserve"> target runs one simulated hour of operation accelerated. On hardware, six consecutive procedures completed without a kernel fault, and the dual-input run demonstrated trip → reset → permit → second independent trip within a single run.</w:t>
+        <w:t xml:space="preserve"> runs one accelerated simulated hour. On hardware, six procedures completed without a kernel fault. The dual-input run also demonstrated trip → reset → permit → a second independent trip within one run.</w:t>
       </w:r>
     </w:p>
     <w:p>
@@ -3523,8 +4047,34 @@
       </w:r>
     </w:p>
     <w:p>
+      <w:pPr>
+        <w:pStyle w:val="Heading3"/>
+      </w:pPr>
       <w:r>
-        <w:t xml:space="preserve">The capstone direction is a </w:t>
+        <w:t>7.1 End Customer, Industry Opportunity, and Enabling Advances</w:t>
+      </w:r>
+    </w:p>
+    <w:p>
+      <w:r>
+        <w:t>The end customer is not a general chatbot user. It is the owner or commissioner of a test bench: a lab engineer defining a qualification, a technician repeating it, or a team that needs an auditable record to survive a shift change. Phase 3's immediate customer context is a university dry bench. The capstone target is a customer with an already-understood rig who wants safer guided operation and consistent evidence.</w:t>
+      </w:r>
+    </w:p>
+    <w:p>
+      <w:r>
+        <w:t>Relevant applications include hydraulic test carts, battery and vehicle benches on CAN, factory cells using Siemens or Allen-Bradley controllers, and Modbus skids. Electrification, connected industrial equipment, and increasingly software-defined products are the proposed growth drivers because they create more sensors, configurations, and repeatable verification work. Three technical advances make CertaRig timely: capable low-cost edge computers can run the kernel beside a rig; standard protocols such as MQTT, Modbus, OPC UA, and CAN expose structured signals; and tool-using language-model APIs can translate operator intent without being given output authority. Digital twins and inexpensive cryptographic hashing add rehearsal and auditable evidence. CertaRig combines those advances while keeping the safety decision deterministic. This is a product hypothesis, not a quantified market claim; capstone customer interviews must test it.</w:t>
+      </w:r>
+    </w:p>
+    <w:p>
+      <w:pPr>
+        <w:pStyle w:val="Heading3"/>
+      </w:pPr>
+      <w:r>
+        <w:t>7.2 Summary of Capstone Missions</w:t>
+      </w:r>
+    </w:p>
+    <w:p>
+      <w:r>
+        <w:t xml:space="preserve">The capstone product is a </w:t>
       </w:r>
       <w:r>
         <w:rPr>
@@ -3533,7 +4083,7 @@
         <w:t>deployable agentic test-operations layer for someone else's mapped rig</w:t>
       </w:r>
       <w:r>
-        <w:t>. The end customer is not a chatbot user: it is the person who already owns or is commissioning a test bench — a lab engineer, a technician repeating the same qualification, a team that needs a record that survives the shift change. Today that customer is the project's own university dry bench; tomorrow it is anyone with a mapped rig (a hydraulic cart, a battery pack on CAN, a Siemens or Allen-Bradley cell, a Modbus skid) in industries where test and commissioning workloads are growing. The planned missions, in order of dependency:</w:t>
+        <w:t>. Its planned missions, in dependency order, are:</w:t>
       </w:r>
     </w:p>
     <w:p>
@@ -3633,7 +4183,27 @@
         <w:t>Live-provider qualification.</w:t>
       </w:r>
       <w:r>
-        <w:t xml:space="preserve"> Benchmark Claude Sonnet 4.5 and the OpenAI fallback on the project's own use case — approved-skill routing accuracy, tool discipline under the capability manifest, refusal to compare numbers, correct stopping at human-approval boundaries — using the replay provider for exact regression, before any live model is used near a bench.</w:t>
+        <w:t xml:space="preserve"> Run </w:t>
+      </w:r>
+      <w:r>
+        <w:rPr>
+          <w:rFonts w:ascii="Consolas" w:hAnsi="Consolas"/>
+          <w:sz w:val="20"/>
+        </w:rPr>
+        <w:t>claude-sonnet-4-5</w:t>
+      </w:r>
+      <w:r>
+        <w:t xml:space="preserve"> and </w:t>
+      </w:r>
+      <w:r>
+        <w:rPr>
+          <w:rFonts w:ascii="Consolas" w:hAnsi="Consolas"/>
+          <w:sz w:val="20"/>
+        </w:rPr>
+        <w:t>gpt-4.1-mini</w:t>
+      </w:r>
+      <w:r>
+        <w:t xml:space="preserve"> through the Section 2.3 benchmark: approved-skill routing, capability-manifest discipline, no numeric safety decisions, correct approval stops, and replayable results. A live model remains optional and outside the kernel.</w:t>
       </w:r>
     </w:p>
     <w:p>
@@ -3647,7 +4217,20 @@
         <w:t>Broader industry reach.</w:t>
       </w:r>
       <w:r>
-        <w:t xml:space="preserve"> Extend observe-mode adapters toward the buses growing industries already use — factory OPC UA cells, battery/vehicle benches on CAN, Modbus skids — always observe-first, with human-applied maps.</w:t>
+        <w:t xml:space="preserve"> Extend observe-mode adapters toward factory OPC UA cells, battery and vehicle benches on CAN, and Modbus skids. Every new integration starts observe-only and uses a human-applied map.</w:t>
+      </w:r>
+    </w:p>
+    <w:p>
+      <w:pPr>
+        <w:pStyle w:val="Heading3"/>
+      </w:pPr>
+      <w:r>
+        <w:t>7.3 Readiness to Move to the Capstone</w:t>
+      </w:r>
+    </w:p>
+    <w:p>
+      <w:r>
+        <w:t>CertaRig is ready for the capstone as a platform foundation, not as a finished industrial product. The kernel, Edge API, simulator gate, approvals, Studio workflow, and hardware procedure path exist and have evidence. The next work is therefore a bounded extension—commissioning a second mapped rig safely—rather than a redesign of the safety architecture. Readiness is conditional on preserving three rules: no unreviewed map reaches an output, simulated evidence is never presented as hardware, and no live model is admitted until it passes the use-case benchmark. Industrial sale or safety certification would require additional work beyond the capstone, including electrical output feedback, completed evidence export, broader hardware validation, and appropriate certified safeguards.</w:t>
       </w:r>
     </w:p>
     <w:p>
@@ -3697,7 +4280,7 @@
         <w:t>Honesty about the AI stack matters.</w:t>
       </w:r>
       <w:r>
-        <w:t xml:space="preserve"> Keeping three distinct facts straight — the build-time assistant (Cursor with Grok 4.6, which never touches the relay), the runtime default (Fake, deterministic, the actual bench path), and the intended live adapters (Claude first, OpenAI fallback, present but unproven) — prevented the project from over-claiming, and shaped a benchmark philosophy of measuring models on this use case (skill routing, tool discipline) rather than chat quality.</w:t>
+        <w:t xml:space="preserve"> The build-time coding assistant does not operate the product. At runtime, Fake is the proven deterministic path; Claude is the intended first live choice and OpenAI the fallback, but both remain unproven live. Keeping those roles separate prevented over-claiming and led to a benchmark based on skill routing and tool discipline rather than chat quality.</w:t>
       </w:r>
     </w:p>
     <w:p>
@@ -4246,12 +4829,12 @@
     </w:p>
     <w:p>
       <w:r>
-        <w:t>Phase 3 set out to demonstrate implementation readiness, and the evidence supports that it did. The design choice at the heart of the project — an agent that interprets while a deterministic kernel measures, compares, latches, and owns the output — was implemented in full and validated on real hardware through a disciplined six-gate ladder: 213 software tests pass, six exact procedure hashes crossed the digital twin before hardware, six hardware runs recorded 3,422 samples and passed 34 of 34 evaluated checks, guardrails tripped and latched at 4.2 bar and 15 L/min, the emergency stop's anti-restart held, and the frozen course submission system was verifiably restored afterwards.</w:t>
+        <w:t>Phase 3 demonstrates implementation readiness within a defined boundary. The core architecture—an agent that interprets while a deterministic kernel measures, compares, latches, and owns the output—was validated through a six-gate hardware progression. In this environment, 213 software tests passed. On 12 September, six exact procedure hashes passed the twin gate before six hardware runs recorded 3,422 samples and passed 34 of 34 checks. The 4.2 bar and 15 L/min guardrails latched safe, E-stop anti-restart held, and the frozen course system was restored and verified.</w:t>
       </w:r>
     </w:p>
     <w:p>
       <w:r>
-        <w:t>Just as importantly, the project knows its own edges: the missing raw CSVs in exported bundles, the unproven live-LLM path, the command-derived relay state, and the not-yet-built commissioning interview are stated, with concrete corrections planned. That combination — a working, honestly-scoped system with hardware evidence and a defined next invariant ("no unreviewed mapping can reach an output") — is exactly the foundation the capstone needs. The objectives of Phase 3 are achieved, and the project is prepared to move into the capstone: making CertaRig deployable on someone else's mapped rig, beginning with the commissioning interview.</w:t>
+        <w:t>The result does not prove live-LLM operation, unknown-rig discovery, fieldbus actuation, or mechanical relay latency. It also leaves raw CSV export incomplete. Those limits define the capstone rather than weaken the Phase 3 result: build the commissioning interview, prove a second plant, complete evidence export, add electrical feedback, and qualify live providers. The project is ready to proceed on that bounded mission while retaining the invariant that no unreviewed mapping can reach an output.</w:t>
       </w:r>
     </w:p>
     <w:p>

</xml_diff>

<commit_message>
Publish Phase 3 video links and make captions work without ffmpeg drawtext.
Co-authored-by: Cursor <cursoragent@cursor.com>
</commit_message>
<xml_diff>
--- a/deliverables/phase3-document/CertaRig_Phase3_Document.docx
+++ b/deliverables/phase3-document/CertaRig_Phase3_Document.docx
@@ -4786,33 +4786,20 @@
               <w:rPr>
                 <w:sz w:val="20"/>
               </w:rPr>
-              <w:t xml:space="preserve"> (script and production pack in </w:t>
-            </w:r>
-            <w:r>
-              <w:rPr>
-                <w:rFonts w:ascii="Consolas" w:hAnsi="Consolas"/>
-                <w:sz w:val="20"/>
-              </w:rPr>
-              <w:t>docs/explainer/phase3-film/</w:t>
-            </w:r>
-            <w:r>
-              <w:rPr>
-                <w:sz w:val="20"/>
-              </w:rPr>
-              <w:t xml:space="preserve">; ~12-minute stitched demo with diagrams and labelled live captures) and the </w:t>
+              <w:t xml:space="preserve"> (12.7 min): [CertaRig_Phase3_Film.mp4](https://github.com/shadybrook/certarig-platform/releases/download/phase3-submission-videos-2026-09-17/CertaRig_Phase3_Film.mp4). </w:t>
             </w:r>
             <w:r>
               <w:rPr>
                 <w:b/>
                 <w:sz w:val="20"/>
               </w:rPr>
-              <w:t>uncut dry-bench demo video</w:t>
-            </w:r>
-            <w:r>
-              <w:rPr>
-                <w:sz w:val="20"/>
-              </w:rPr>
-              <w:t xml:space="preserve"> on Google Drive — links to be added at submission [links TBD]</w:t>
+              <w:t>Uncut clap-synced bench run</w:t>
+            </w:r>
+            <w:r>
+              <w:rPr>
+                <w:sz w:val="20"/>
+              </w:rPr>
+              <w:t xml:space="preserve"> (29.6 min, screen + top-down picture-in-picture): [CertaRig_Phase3_Uncut_Bench_Run.mp4](https://github.com/shadybrook/certarig-platform/releases/download/phase3-submission-videos-2026-09-17/CertaRig_Phase3_Uncut_Bench_Run.mp4). Release page: https://github.com/shadybrook/certarig-platform/releases/tag/phase3-submission-videos-2026-09-17. Source footage folder: https://drive.google.com/drive/folders/1mlegZnq_AQurnBIKY-Ckh1S6TyZ_Q8Bk</w:t>
             </w:r>
           </w:p>
         </w:tc>

</xml_diff>

<commit_message>
Log the explainer-pack v4 film and point docs at the rebuilt release.
Outcome v4 now records paper motion (atelier retired), selftest PASS, 13.4 min
film, and the replaced phase3-submission-videos-v4 film asset.

Co-authored-by: Chintan Dedhia <shadybrook@users.noreply.github.com>
</commit_message>
<xml_diff>
--- a/deliverables/phase3-document/CertaRig_Phase3_Document.docx
+++ b/deliverables/phase3-document/CertaRig_Phase3_Document.docx
@@ -4780,13 +4780,13 @@
                 <w:b/>
                 <w:sz w:val="20"/>
               </w:rPr>
-              <w:t>Phase 3 submission film</w:t>
-            </w:r>
-            <w:r>
-              <w:rPr>
-                <w:sz w:val="20"/>
-              </w:rPr>
-              <w:t xml:space="preserve"> (12.7 min): [CertaRig_Phase3_Film.mp4](https://github.com/shadybrook/certarig-platform/releases/download/phase3-submission-videos-2026-09-17/CertaRig_Phase3_Film.mp4). </w:t>
+              <w:t>Phase 3 submission film v4</w:t>
+            </w:r>
+            <w:r>
+              <w:rPr>
+                <w:sz w:val="20"/>
+              </w:rPr>
+              <w:t xml:space="preserve"> (13.4 min, paper explainer motion + designed Studio/bench split; atelier lookbook retired): [CertaRig_Phase3_Film.mp4](https://github.com/shadybrook/certarig-platform/releases/download/phase3-submission-videos-v4/CertaRig_Phase3_Film.mp4). </w:t>
             </w:r>
             <w:r>
               <w:rPr>
@@ -4799,7 +4799,46 @@
               <w:rPr>
                 <w:sz w:val="20"/>
               </w:rPr>
-              <w:t xml:space="preserve"> (29.6 min, screen + top-down picture-in-picture): [CertaRig_Phase3_Uncut_Bench_Run.mp4](https://github.com/shadybrook/certarig-platform/releases/download/phase3-submission-videos-2026-09-17/CertaRig_Phase3_Uncut_Bench_Run.mp4). Release page: https://github.com/shadybrook/certarig-platform/releases/tag/phase3-submission-videos-2026-09-17. Source footage folder: https://drive.google.com/drive/folders/1mlegZnq_AQurnBIKY-Ckh1S6TyZ_Q8Bk</w:t>
+              <w:t xml:space="preserve"> (29.6 min, 1310+608 split, no overlay PiP): [CertaRig_Phase3_Uncut_Bench_Run.mp4](https://github.com/shadybrook/certarig-platform/releases/download/phase3-submission-videos-v4/CertaRig_Phase3_Uncut_Bench_Run.mp4). </w:t>
+            </w:r>
+            <w:r>
+              <w:rPr>
+                <w:b/>
+                <w:sz w:val="20"/>
+              </w:rPr>
+              <w:t>Action windows</w:t>
+            </w:r>
+            <w:r>
+              <w:rPr>
+                <w:sz w:val="20"/>
+              </w:rPr>
+              <w:t xml:space="preserve"> (no VO): [CertaRig_Phase3_Uncut_Action.mp4](https://github.com/shadybrook/certarig-platform/releases/download/phase3-submission-videos-v4/CertaRig_Phase3_Uncut_Action.mp4). Release page: https://github.com/shadybrook/certarig-platform/releases/tag/phase3-submission-videos-v4. Cut list: </w:t>
+            </w:r>
+            <w:r>
+              <w:rPr>
+                <w:rFonts w:ascii="Consolas" w:hAnsi="Consolas"/>
+                <w:sz w:val="20"/>
+              </w:rPr>
+              <w:t>tools/phase3_edit/edl/phase3_film_v4.json</w:t>
+            </w:r>
+            <w:r>
+              <w:rPr>
+                <w:sz w:val="20"/>
+              </w:rPr>
+              <w:t xml:space="preserve">. Motion: </w:t>
+            </w:r>
+            <w:r>
+              <w:rPr>
+                <w:rFonts w:ascii="Consolas" w:hAnsi="Consolas"/>
+                <w:sz w:val="20"/>
+              </w:rPr>
+              <w:t>python3 tools/render_phase3_explainer.py</w:t>
+            </w:r>
+            <w:r>
+              <w:rPr>
+                <w:sz w:val="20"/>
+              </w:rPr>
+              <w:t>. Source footage folder: https://drive.google.com/drive/folders/1mlegZnq_AQurnBIKY-Ckh1S6TyZ_Q8Bk</w:t>
             </w:r>
           </w:p>
         </w:tc>

</xml_diff>